<commit_message>
Update Self evaluation 34315_Anders.docx
</commit_message>
<xml_diff>
--- a/FinalProject_Learn/Self evaluation 34315_Anders.docx
+++ b/FinalProject_Learn/Self evaluation 34315_Anders.docx
@@ -241,7 +241,21 @@
           <w:bCs/>
         </w:rPr>
         <w:br/>
-        <w:t>3D-printing(~70 %) and mechanical troubleshooting</w:t>
+        <w:t>3D-</w:t>
+      </w:r>
+      <w:proofErr w:type="gramStart"/>
+      <w:r>
+        <w:rPr>
+          <w:bCs/>
+        </w:rPr>
+        <w:t>printing(</w:t>
+      </w:r>
+      <w:proofErr w:type="gramEnd"/>
+      <w:r>
+        <w:rPr>
+          <w:bCs/>
+        </w:rPr>
+        <w:t>~70 %) and mechanical troubleshooting</w:t>
       </w:r>
       <w:r>
         <w:rPr>
@@ -585,7 +599,21 @@
           <w:bCs/>
         </w:rPr>
         <w:br/>
-        <w:t xml:space="preserve">In the power calculations I used formulas from an earlier course as well, making the power budget fairly straightforward to put together.</w:t>
+        <w:t xml:space="preserve">In the power calculations I used formulas from an earlier course as well, making the power budget </w:t>
+      </w:r>
+      <w:proofErr w:type="gramStart"/>
+      <w:r>
+        <w:rPr>
+          <w:bCs/>
+        </w:rPr>
+        <w:t>fairly straightforward</w:t>
+      </w:r>
+      <w:proofErr w:type="gramEnd"/>
+      <w:r>
+        <w:rPr>
+          <w:bCs/>
+        </w:rPr>
+        <w:t xml:space="preserve"> to put together.</w:t>
       </w:r>
     </w:p>
     <w:p>
@@ -803,12 +831,14 @@
           <w:bCs/>
         </w:rPr>
       </w:pPr>
+      <w:proofErr w:type="gramStart"/>
       <w:r>
         <w:rPr>
           <w:bCs/>
         </w:rPr>
         <w:t>Log Book</w:t>
       </w:r>
+      <w:proofErr w:type="gramEnd"/>
       <w:r>
         <w:rPr>
           <w:bCs/>
@@ -863,21 +893,7 @@
         <w:rPr>
           <w:bCs/>
         </w:rPr>
-        <w:t xml:space="preserve">Technical </w:t>
-      </w:r>
-      <w:proofErr w:type="spellStart"/>
-      <w:r>
-        <w:rPr>
-          <w:bCs/>
-        </w:rPr>
-        <w:t>Highlights</w:t>
-      </w:r>
-      <w:proofErr w:type="spellEnd"/>
-      <w:r>
-        <w:rPr>
-          <w:bCs/>
-        </w:rPr>
-        <w:t xml:space="preserve"> (Power calc)</w:t>
+        <w:t>Technical Highlights (Power calc)</w:t>
       </w:r>
       <w:r>
         <w:rPr>
@@ -1115,27 +1131,55 @@
         <w:rPr>
           <w:bCs/>
         </w:rPr>
-        <w:t>It is tricky to judge yourself, I think that I generally did a good job.</w:t>
-      </w:r>
-    </w:p>
-    <w:p>
-      <w:pPr>
-        <w:rPr>
-          <w:b/>
-        </w:rPr>
-      </w:pPr>
-    </w:p>
-    <w:p>
-      <w:pPr>
-        <w:rPr>
-          <w:b/>
-        </w:rPr>
-      </w:pPr>
-      <w:r>
-        <w:rPr>
-          <w:b/>
-        </w:rPr>
-        <w:t>34315 is a 5 ECTS point course. Each ECTS point consists of 28 working hours. Totally 140 hours. This means approx. 10.1 hours for every single week in the 13 week period. Have I spent (please circle):</w:t>
+        <w:t xml:space="preserve">It is tricky to judge </w:t>
+      </w:r>
+      <w:proofErr w:type="gramStart"/>
+      <w:r>
+        <w:rPr>
+          <w:bCs/>
+        </w:rPr>
+        <w:t>yourself,</w:t>
+      </w:r>
+      <w:proofErr w:type="gramEnd"/>
+      <w:r>
+        <w:rPr>
+          <w:bCs/>
+        </w:rPr>
+        <w:t xml:space="preserve"> I think that I generally did a good job.</w:t>
+      </w:r>
+    </w:p>
+    <w:p>
+      <w:pPr>
+        <w:rPr>
+          <w:b/>
+        </w:rPr>
+      </w:pPr>
+    </w:p>
+    <w:p>
+      <w:pPr>
+        <w:rPr>
+          <w:b/>
+        </w:rPr>
+      </w:pPr>
+      <w:r>
+        <w:rPr>
+          <w:b/>
+        </w:rPr>
+        <w:t xml:space="preserve">34315 is a 5 ECTS point course. Each ECTS point consists of 28 working hours. Totally 140 hours. This means approx. 10.1 hours for every single week in the </w:t>
+      </w:r>
+      <w:proofErr w:type="gramStart"/>
+      <w:r>
+        <w:rPr>
+          <w:b/>
+        </w:rPr>
+        <w:t>13 week</w:t>
+      </w:r>
+      <w:proofErr w:type="gramEnd"/>
+      <w:r>
+        <w:rPr>
+          <w:b/>
+        </w:rPr>
+        <w:t xml:space="preserve"> period. Have I spent (please circle):</w:t>
       </w:r>
     </w:p>
     <w:p>
@@ -1227,11 +1271,25 @@
           <w:b/>
         </w:rPr>
       </w:pPr>
-      <w:r>
-        <w:rPr>
-          <w:bCs/>
-        </w:rPr>
-        <w:t xml:space="preserve">Overall I am happy with my work on the project. A lot of my tasks (3d-printing, poster, the LM35 filter and the display) built on experience or code from earlier courses, so I could work fast and put more time into the mechanical side and the practical coordination. I think I contributed my fair share and got a good deal out of it, both technically and from working together as a group.</w:t>
+      <w:proofErr w:type="spellStart"/>
+      <w:r>
+        <w:rPr>
+          <w:bCs/>
+        </w:rPr>
+        <w:t>Overall</w:t>
+      </w:r>
+      <w:r>
+        <w:rPr>
+          <w:bCs/>
+        </w:rPr>
+        <w:t>l</w:t>
+      </w:r>
+      <w:proofErr w:type="spellEnd"/>
+      <w:r>
+        <w:rPr>
+          <w:bCs/>
+        </w:rPr>
+        <w:t xml:space="preserve"> I am happy with my work on the project. A lot of my tasks (3d-printing, poster, the LM35 filter and the display) built on experience or code from earlier courses, so I could work fast and put more time into the mechanical side and the practical coordination. I think I contributed my fair share and got a good deal out of it, both technically and from working together as a group.</w:t>
       </w:r>
     </w:p>
     <w:p>
@@ -1343,15 +1401,6 @@
         <w:tab/>
         <w:t>No</w:t>
       </w:r>
-    </w:p>
-    <w:p>
-      <w:pPr>
-        <w:rPr>
-          <w:b/>
-          <w:sz w:val="28"/>
-          <w:szCs w:val="24"/>
-        </w:rPr>
-      </w:pPr>
     </w:p>
     <w:p/>
     <w:sectPr>

</xml_diff>